<commit_message>
[FIX] Validacion RED 1.1
</commit_message>
<xml_diff>
--- a/fuentes/CF2_41730034_DI.docx
+++ b/fuentes/CF2_41730034_DI.docx
@@ -503,7 +503,7 @@
                 <w:sz w:val="20"/>
                 <w:szCs w:val="20"/>
               </w:rPr>
-              <w:t>ógicas dentro del plan decenal de salud pública (PDSP) 2012-2021 y la estrategia de entornos s</w:t>
+              <w:t>ógicas dentro del Plan Decenal de Salud Pública (PDSP) 2012-2021 y la Estrategia de Entornos S</w:t>
             </w:r>
             <w:r>
               <w:rPr>
@@ -901,7 +901,7 @@
           <w:szCs w:val="24"/>
         </w:rPr>
         <w:lastRenderedPageBreak/>
-        <w:t>2. Evaluación de la estrategia de entornos s</w:t>
+        <w:t>2. Evaluación de la Estrategia de Entornos S</w:t>
       </w:r>
       <w:r>
         <w:rPr>
@@ -924,23 +924,72 @@
           <w:sz w:val="24"/>
           <w:szCs w:val="24"/>
         </w:rPr>
-        <w:t>2.1. Estructura general para la implementación de la estrategia de entornos saludables (EES)</w:t>
-      </w:r>
-    </w:p>
-    <w:p>
-      <w:pPr>
-        <w:pStyle w:val="Normal0"/>
-        <w:rPr>
-          <w:sz w:val="24"/>
-          <w:szCs w:val="24"/>
-        </w:rPr>
-      </w:pPr>
-      <w:r>
-        <w:rPr>
-          <w:sz w:val="24"/>
-          <w:szCs w:val="24"/>
-        </w:rPr>
-        <w:t>2.2. Plan de acción intersectorial de entornos saludables (PAIES)</w:t>
+        <w:t>2.1. Estructura genera</w:t>
+      </w:r>
+      <w:r>
+        <w:rPr>
+          <w:sz w:val="24"/>
+          <w:szCs w:val="24"/>
+        </w:rPr>
+        <w:t>l para la implementación de la E</w:t>
+      </w:r>
+      <w:r>
+        <w:rPr>
+          <w:sz w:val="24"/>
+          <w:szCs w:val="24"/>
+        </w:rPr>
+        <w:t>strategia</w:t>
+      </w:r>
+      <w:r>
+        <w:rPr>
+          <w:sz w:val="24"/>
+          <w:szCs w:val="24"/>
+        </w:rPr>
+        <w:t xml:space="preserve"> de Entornos </w:t>
+      </w:r>
+      <w:r>
+        <w:rPr>
+          <w:sz w:val="24"/>
+          <w:szCs w:val="24"/>
+        </w:rPr>
+        <w:t>Saludables</w:t>
+      </w:r>
+      <w:r>
+        <w:rPr>
+          <w:sz w:val="24"/>
+          <w:szCs w:val="24"/>
+        </w:rPr>
+        <w:t xml:space="preserve"> (</w:t>
+      </w:r>
+      <w:r>
+        <w:rPr>
+          <w:sz w:val="24"/>
+          <w:szCs w:val="24"/>
+        </w:rPr>
+        <w:t>EES)</w:t>
+      </w:r>
+    </w:p>
+    <w:p>
+      <w:pPr>
+        <w:pStyle w:val="Normal0"/>
+        <w:rPr>
+          <w:sz w:val="24"/>
+          <w:szCs w:val="24"/>
+        </w:rPr>
+      </w:pPr>
+      <w:r>
+        <w:rPr>
+          <w:sz w:val="24"/>
+          <w:szCs w:val="24"/>
+        </w:rPr>
+        <w:t>2.2. Plan de Acción Intersectorial de Entornos S</w:t>
+      </w:r>
+      <w:r>
+        <w:rPr>
+          <w:sz w:val="24"/>
+          <w:szCs w:val="24"/>
+        </w:rPr>
+        <w:t>aludables (PAIES)</w:t>
       </w:r>
     </w:p>
     <w:p>
@@ -972,7 +1021,21 @@
           <w:sz w:val="24"/>
           <w:szCs w:val="24"/>
         </w:rPr>
-        <w:t>4. Directrices para la caracterización y seguimiento de la estrategia de entornos saludables (EES)</w:t>
+        <w:t>4. Directrices para la carac</w:t>
+      </w:r>
+      <w:r>
+        <w:rPr>
+          <w:sz w:val="24"/>
+          <w:szCs w:val="24"/>
+        </w:rPr>
+        <w:t>terización y seguimiento de la Estrategia de Entornos S</w:t>
+      </w:r>
+      <w:r>
+        <w:rPr>
+          <w:sz w:val="24"/>
+          <w:szCs w:val="24"/>
+        </w:rPr>
+        <w:t>aludables (EES)</w:t>
       </w:r>
     </w:p>
     <w:p>
@@ -1221,7 +1284,14 @@
           <w:sz w:val="24"/>
           <w:szCs w:val="24"/>
         </w:rPr>
-        <w:t>niciativa de escuelas promotoras de la salud (EPS), esta estrategia involucra a distintos niveles de gobierno y busca crear entornos escolares que favorezcan el bienestar integral de niños y niñas. Con este aprendizaje aprenderás a identificar y aplicar técnicas de evaluación que permiten medir el impacto de estas acciones en la comunidad escolar.</w:t>
+        <w:t>niciativa de Escuelas Promotoras de la S</w:t>
+      </w:r>
+      <w:r>
+        <w:rPr>
+          <w:sz w:val="24"/>
+          <w:szCs w:val="24"/>
+        </w:rPr>
+        <w:t>alud (EPS), esta estrategia involucra a distintos niveles de gobierno y busca crear entornos escolares que favorezcan el bienestar integral de niños y niñas. Con este aprendizaje aprenderás a identificar y aplicar técnicas de evaluación que permiten medir el impacto de estas acciones en la comunidad escolar.</w:t>
       </w:r>
     </w:p>
     <w:p>
@@ -1307,14 +1377,22 @@
           <w:sz w:val="24"/>
           <w:szCs w:val="24"/>
         </w:rPr>
-        <w:t>La organización mundial de la salud (OMS) y la organización panamericana de la s</w:t>
-      </w:r>
-      <w:r>
-        <w:rPr>
-          <w:sz w:val="24"/>
-          <w:szCs w:val="24"/>
-        </w:rPr>
-        <w:t>alud (OPS) definen la escuela saludable como un espacio que promueve el bienestar integral de la comunidad educativa a través de acciones coordinadas de promoción y protección de la salud.</w:t>
+        <w:t>La Organización Mundial de la Salud (OMS) y la Organización Panamericana de la S</w:t>
+      </w:r>
+      <w:r>
+        <w:rPr>
+          <w:sz w:val="24"/>
+          <w:szCs w:val="24"/>
+        </w:rPr>
+        <w:t xml:space="preserve">alud (OPS) definen la escuela saludable como un espacio que promueve el bienestar integral de </w:t>
+      </w:r>
+      <w:r>
+        <w:rPr>
+          <w:sz w:val="24"/>
+          <w:szCs w:val="24"/>
+        </w:rPr>
+        <w:lastRenderedPageBreak/>
+        <w:t>la comunidad educativa a través de acciones coordinadas de promoción y protección de la salud.</w:t>
       </w:r>
     </w:p>
     <w:p>
@@ -1737,6 +1815,7 @@
           <w:sz w:val="24"/>
           <w:szCs w:val="24"/>
         </w:rPr>
+        <w:lastRenderedPageBreak/>
         <w:t>Promoverá</w:t>
       </w:r>
       <w:r>
@@ -1779,7 +1858,6 @@
           <w:szCs w:val="24"/>
           <w:u w:val="single"/>
         </w:rPr>
-        <w:lastRenderedPageBreak/>
         <w:t>Componentes de la estrategia de escuela s</w:t>
       </w:r>
       <w:r>
@@ -1817,7 +1895,21 @@
           <w:sz w:val="24"/>
           <w:szCs w:val="24"/>
         </w:rPr>
-        <w:t>De acuerdo con los lineamientos actualizados del ministerio de salud y protección social, la estrategia de escuela saludable (EES) se basa en cinco componentes fundamentales que buscan promover la salud y el bienestar</w:t>
+        <w:t>De acuerdo con los lineamientos actualizados del ministerio de</w:t>
+      </w:r>
+      <w:r>
+        <w:rPr>
+          <w:sz w:val="24"/>
+          <w:szCs w:val="24"/>
+        </w:rPr>
+        <w:t xml:space="preserve"> salud y protección social, la Estrategia de Escuela S</w:t>
+      </w:r>
+      <w:r>
+        <w:rPr>
+          <w:sz w:val="24"/>
+          <w:szCs w:val="24"/>
+        </w:rPr>
+        <w:t>aludable (EES) se basa en cinco componentes fundamentales que buscan promover la salud y el bienestar</w:t>
       </w:r>
       <w:r>
         <w:rPr>
@@ -2197,34 +2289,41 @@
           <w:sz w:val="24"/>
           <w:szCs w:val="24"/>
         </w:rPr>
-        <w:t>promueve la participación activa de la comunidad educativa (estudiantes, docentes, familias, directivos y comunidad) en todas las etapas de la estrategia, busca que las personas se apropien de la iniciativa, la adapten a sus necesidades y contribuyan a su sostenibilidad, su objetivo es fortalecer la capacidad de la comunidad escolar para identificar problemas, proponer soluciones y liderar procesos de cambio que mejoren la salud y el bienestar colectivo.</w:t>
-      </w:r>
-    </w:p>
-    <w:p>
-      <w:pPr>
-        <w:pStyle w:val="Normal0"/>
-        <w:rPr>
-          <w:sz w:val="24"/>
-          <w:szCs w:val="24"/>
-        </w:rPr>
-      </w:pPr>
-    </w:p>
-    <w:p>
-      <w:pPr>
-        <w:pStyle w:val="Normal0"/>
-        <w:rPr>
-          <w:b/>
-          <w:sz w:val="24"/>
-          <w:szCs w:val="24"/>
-        </w:rPr>
-      </w:pPr>
-      <w:r>
-        <w:rPr>
-          <w:b/>
+        <w:t xml:space="preserve">promueve la participación activa de la comunidad educativa (estudiantes, docentes, familias, directivos y comunidad) en todas las etapas de la estrategia, busca que las personas se apropien de la iniciativa, la adapten a sus necesidades y contribuyan a su sostenibilidad, su objetivo es fortalecer la capacidad de la </w:t>
+      </w:r>
+      <w:r>
+        <w:rPr>
           <w:sz w:val="24"/>
           <w:szCs w:val="24"/>
         </w:rPr>
         <w:lastRenderedPageBreak/>
+        <w:t>comunidad escolar para identificar problemas, proponer soluciones y liderar procesos de cambio que mejoren la salud y el bienestar colectivo.</w:t>
+      </w:r>
+    </w:p>
+    <w:p>
+      <w:pPr>
+        <w:pStyle w:val="Normal0"/>
+        <w:rPr>
+          <w:sz w:val="24"/>
+          <w:szCs w:val="24"/>
+        </w:rPr>
+      </w:pPr>
+    </w:p>
+    <w:p>
+      <w:pPr>
+        <w:pStyle w:val="Normal0"/>
+        <w:rPr>
+          <w:b/>
+          <w:sz w:val="24"/>
+          <w:szCs w:val="24"/>
+        </w:rPr>
+      </w:pPr>
+      <w:r>
+        <w:rPr>
+          <w:b/>
+          <w:sz w:val="24"/>
+          <w:szCs w:val="24"/>
+        </w:rPr>
         <w:t xml:space="preserve">4. Educación para la salud: </w:t>
       </w:r>
       <w:r>
@@ -2232,7 +2331,21 @@
           <w:sz w:val="24"/>
           <w:szCs w:val="24"/>
         </w:rPr>
-        <w:t xml:space="preserve">este componente integra contenidos y metodologías sobre promoción de la salud dentro del currículo escolar y el proyecto educativo institucional (PEI). Se busca desarrollar en los estudiantes habilidades para la vida como la toma de decisiones saludables, la prevención de riesgos, la convivencia pacífica y la </w:t>
+        <w:t>este componente integra contenidos y metodologías sobre promoción de la salud den</w:t>
+      </w:r>
+      <w:r>
+        <w:rPr>
+          <w:sz w:val="24"/>
+          <w:szCs w:val="24"/>
+        </w:rPr>
+        <w:t>tro del currículo escolar y el Proyecto Educativo I</w:t>
+      </w:r>
+      <w:r>
+        <w:rPr>
+          <w:sz w:val="24"/>
+          <w:szCs w:val="24"/>
+        </w:rPr>
+        <w:t xml:space="preserve">nstitucional (PEI). Se busca desarrollar en los estudiantes habilidades para la vida como la toma de decisiones saludables, la prevención de riesgos, la convivencia pacífica y la </w:t>
       </w:r>
       <w:r>
         <w:rPr>
@@ -2478,7 +2591,49 @@
           <w:sz w:val="24"/>
           <w:szCs w:val="24"/>
         </w:rPr>
-        <w:t>Además de los cinco componentes principales, la estrategia de escuelas saludables (EES) incluye intervenciones transversales que fortalecen su implementación y aseguran una mirada integral de la salud en el entorno educativo, estas intervenciones fueron definidas por la organización mundial de la salud (OMS) y la organización panamericana de la salud (OPS) como elementos clave para garantizar que las acciones en las escuelas tengan un impacto sostenible y efectivo.</w:t>
+        <w:t>Además de los cin</w:t>
+      </w:r>
+      <w:r>
+        <w:rPr>
+          <w:sz w:val="24"/>
+          <w:szCs w:val="24"/>
+        </w:rPr>
+        <w:t>co componentes principales, la Estrategia de Escuelas S</w:t>
+      </w:r>
+      <w:r>
+        <w:rPr>
+          <w:sz w:val="24"/>
+          <w:szCs w:val="24"/>
+        </w:rPr>
+        <w:t>aludables (EES) incluye intervenciones transversales que fortalecen su implementación y aseguran una mirada integral de la salud en el entorno educativo, estas interven</w:t>
+      </w:r>
+      <w:r>
+        <w:rPr>
+          <w:sz w:val="24"/>
+          <w:szCs w:val="24"/>
+        </w:rPr>
+        <w:t>ciones fueron definidas por la Organización M</w:t>
+      </w:r>
+      <w:r>
+        <w:rPr>
+          <w:sz w:val="24"/>
+          <w:szCs w:val="24"/>
+        </w:rPr>
+        <w:t xml:space="preserve">undial de la </w:t>
+      </w:r>
+      <w:r>
+        <w:rPr>
+          <w:sz w:val="24"/>
+          <w:szCs w:val="24"/>
+        </w:rPr>
+        <w:t>Salud (OMS) y la Organización Panamericana de la S</w:t>
+      </w:r>
+      <w:r>
+        <w:rPr>
+          <w:sz w:val="24"/>
+          <w:szCs w:val="24"/>
+        </w:rPr>
+        <w:t>alud (OPS) como elementos clave para garantizar que las acciones en las escuelas tengan un impacto sostenible y efectivo.</w:t>
       </w:r>
     </w:p>
     <w:p>
@@ -2543,7 +2698,15 @@
           <w:sz w:val="24"/>
           <w:szCs w:val="24"/>
         </w:rPr>
-        <w:t>es responsabilidad de los diferentes actores a nivel nacional, departamental, municipal y local promover la investigación, el monitoreo continuo y la evaluación participativa de las acciones desarroll</w:t>
+        <w:t xml:space="preserve">es responsabilidad de los diferentes actores a nivel nacional, departamental, municipal y local promover la investigación, el </w:t>
+      </w:r>
+      <w:r>
+        <w:rPr>
+          <w:sz w:val="24"/>
+          <w:szCs w:val="24"/>
+        </w:rPr>
+        <w:lastRenderedPageBreak/>
+        <w:t>monitoreo continuo y la evaluación participativa de las acciones desarroll</w:t>
       </w:r>
       <w:r>
         <w:rPr>
@@ -2609,7 +2772,6 @@
           <w:sz w:val="24"/>
           <w:szCs w:val="24"/>
         </w:rPr>
-        <w:lastRenderedPageBreak/>
         <w:t>E</w:t>
       </w:r>
       <w:r>
@@ -3077,6 +3239,7 @@
           <w:sz w:val="24"/>
           <w:szCs w:val="24"/>
         </w:rPr>
+        <w:lastRenderedPageBreak/>
         <w:t>Impulsa la innovación en las estrategias educativas y de salud, adaptándolas a l</w:t>
       </w:r>
       <w:r>
@@ -3137,8 +3300,15 @@
           <w:sz w:val="24"/>
           <w:szCs w:val="24"/>
         </w:rPr>
-        <w:lastRenderedPageBreak/>
-        <w:t>Evaluación de la estrategia de entornos saludables (EES)</w:t>
+        <w:t>Evaluación de la Estrategia de Entornos S</w:t>
+      </w:r>
+      <w:r>
+        <w:rPr>
+          <w:b/>
+          <w:sz w:val="24"/>
+          <w:szCs w:val="24"/>
+        </w:rPr>
+        <w:t>aludables (EES)</w:t>
       </w:r>
     </w:p>
     <w:p>
@@ -3166,7 +3336,14 @@
           <w:sz w:val="24"/>
           <w:szCs w:val="24"/>
         </w:rPr>
-        <w:t>La estrategia de entornos saludables (EES) tiene como propósito promover y garantizar ambientes que favorezcan el bienestar, la salud integral y la calidad de vida de la población en diferentes espacios como la escuela, la vivienda, la comunidad y los lugares de trabajo, para asegurar su adecuada implementación y cumplimiento de los objetivos, es fundamental que las entidades territoriales (departamentos, municipios y distritos) en Colombia</w:t>
+        <w:t>La Estrategia de Entornos S</w:t>
+      </w:r>
+      <w:r>
+        <w:rPr>
+          <w:sz w:val="24"/>
+          <w:szCs w:val="24"/>
+        </w:rPr>
+        <w:t>aludables (EES) tiene como propósito promover y garantizar ambientes que favorezcan el bienestar, la salud integral y la calidad de vida de la población en diferentes espacios como la escuela, la vivienda, la comunidad y los lugares de trabajo, para asegurar su adecuada implementación y cumplimiento de los objetivos, es fundamental que las entidades territoriales (departamentos, municipios y distritos) en Colombia</w:t>
       </w:r>
       <w:r>
         <w:rPr>
@@ -3503,7 +3680,15 @@
           <w:sz w:val="24"/>
           <w:szCs w:val="24"/>
         </w:rPr>
-        <w:t>la evaluación de la EES debe realizarse desde una perspectiva intersectorial, que integre a los sectores de salud, educación, ambiente, desarrollo social, vivienda, agua y saneamiento, y otros actores comunitarios. Solo mediante el trabajo conjunto se pueden lograr cambios sostenibles en los entornos y responder de manera efectiva a los determinantes sociales de la salud.</w:t>
+        <w:t xml:space="preserve">la evaluación de la EES debe realizarse desde una perspectiva intersectorial, que integre a los </w:t>
+      </w:r>
+      <w:r>
+        <w:rPr>
+          <w:sz w:val="24"/>
+          <w:szCs w:val="24"/>
+        </w:rPr>
+        <w:lastRenderedPageBreak/>
+        <w:t>sectores de salud, educación, ambiente, desarrollo social, vivienda, agua y saneamiento, y otros actores comunitarios. Solo mediante el trabajo conjunto se pueden lograr cambios sostenibles en los entornos y responder de manera efectiva a los determinantes sociales de la salud.</w:t>
       </w:r>
     </w:p>
     <w:p>
@@ -3751,6 +3936,7 @@
           <w:sz w:val="24"/>
           <w:szCs w:val="24"/>
         </w:rPr>
+        <w:lastRenderedPageBreak/>
         <w:t xml:space="preserve">2.1. </w:t>
       </w:r>
       <w:r>
@@ -3767,7 +3953,15 @@
           <w:sz w:val="24"/>
           <w:szCs w:val="24"/>
         </w:rPr>
-        <w:t xml:space="preserve"> general para la implementación de la estrategia de entornos s</w:t>
+        <w:t xml:space="preserve"> genera</w:t>
+      </w:r>
+      <w:r>
+        <w:rPr>
+          <w:b/>
+          <w:sz w:val="24"/>
+          <w:szCs w:val="24"/>
+        </w:rPr>
+        <w:t>l para la implementación de la Estrategia de Entornos S</w:t>
       </w:r>
       <w:r>
         <w:rPr>
@@ -3808,7 +4002,6 @@
           <w:szCs w:val="24"/>
           <w:u w:val="single"/>
         </w:rPr>
-        <w:lastRenderedPageBreak/>
         <w:t>Comité técnico nacional de entornos s</w:t>
       </w:r>
       <w:r>
@@ -3884,7 +4077,14 @@
           <w:sz w:val="24"/>
           <w:szCs w:val="24"/>
         </w:rPr>
-        <w:t>Departamento nacional de planeación (DNP)</w:t>
+        <w:t>Departamento Nacional de P</w:t>
+      </w:r>
+      <w:r>
+        <w:rPr>
+          <w:sz w:val="24"/>
+          <w:szCs w:val="24"/>
+        </w:rPr>
+        <w:t>laneación (DNP)</w:t>
       </w:r>
       <w:r>
         <w:rPr>
@@ -3911,7 +4111,14 @@
           <w:sz w:val="24"/>
           <w:szCs w:val="24"/>
         </w:rPr>
-        <w:t>Ministerio de salud y protección social (MPS)</w:t>
+        <w:t>Ministerio de Salud y Protección S</w:t>
+      </w:r>
+      <w:r>
+        <w:rPr>
+          <w:sz w:val="24"/>
+          <w:szCs w:val="24"/>
+        </w:rPr>
+        <w:t>ocial (MPS)</w:t>
       </w:r>
       <w:r>
         <w:rPr>
@@ -3938,7 +4145,14 @@
           <w:sz w:val="24"/>
           <w:szCs w:val="24"/>
         </w:rPr>
-        <w:t>Ministerio de ambiente y desarrollo sostenible (MADS)</w:t>
+        <w:t>Ministerio de Ambiente y Desarrollo S</w:t>
+      </w:r>
+      <w:r>
+        <w:rPr>
+          <w:sz w:val="24"/>
+          <w:szCs w:val="24"/>
+        </w:rPr>
+        <w:t>ostenible (MADS)</w:t>
       </w:r>
       <w:r>
         <w:rPr>
@@ -3965,7 +4179,14 @@
           <w:sz w:val="24"/>
           <w:szCs w:val="24"/>
         </w:rPr>
-        <w:t>Ministerio de educación nacional (MEN)</w:t>
+        <w:t>Ministerio de Educación N</w:t>
+      </w:r>
+      <w:r>
+        <w:rPr>
+          <w:sz w:val="24"/>
+          <w:szCs w:val="24"/>
+        </w:rPr>
+        <w:t>acional (MEN)</w:t>
       </w:r>
       <w:r>
         <w:rPr>
@@ -3992,7 +4213,14 @@
           <w:sz w:val="24"/>
           <w:szCs w:val="24"/>
         </w:rPr>
-        <w:t>Instituto colombiano de bienestar familiar (ICBF)</w:t>
+        <w:t>Instituto Colombiano de Bienestar F</w:t>
+      </w:r>
+      <w:r>
+        <w:rPr>
+          <w:sz w:val="24"/>
+          <w:szCs w:val="24"/>
+        </w:rPr>
+        <w:t>amiliar (ICBF)</w:t>
       </w:r>
       <w:r>
         <w:rPr>
@@ -4019,7 +4247,14 @@
           <w:sz w:val="24"/>
           <w:szCs w:val="24"/>
         </w:rPr>
-        <w:t>Servicio nacional de aprendizaje (SENA)</w:t>
+        <w:t>Servicio Nacional de A</w:t>
+      </w:r>
+      <w:r>
+        <w:rPr>
+          <w:sz w:val="24"/>
+          <w:szCs w:val="24"/>
+        </w:rPr>
+        <w:t>prendizaje (SENA)</w:t>
       </w:r>
       <w:r>
         <w:rPr>
@@ -4080,14 +4315,28 @@
           <w:sz w:val="24"/>
           <w:szCs w:val="24"/>
         </w:rPr>
-        <w:t>ión panamericana de la salud / O</w:t>
-      </w:r>
-      <w:r>
-        <w:rPr>
-          <w:sz w:val="24"/>
-          <w:szCs w:val="24"/>
-        </w:rPr>
-        <w:t>rganización mundial de la salud (OPS/OMS)</w:t>
+        <w:t>ión Panamericana de la S</w:t>
+      </w:r>
+      <w:r>
+        <w:rPr>
+          <w:sz w:val="24"/>
+          <w:szCs w:val="24"/>
+        </w:rPr>
+        <w:t>alud / O</w:t>
+      </w:r>
+      <w:r>
+        <w:rPr>
+          <w:sz w:val="24"/>
+          <w:szCs w:val="24"/>
+        </w:rPr>
+        <w:t>rganización Mundial de la S</w:t>
+      </w:r>
+      <w:r>
+        <w:rPr>
+          <w:sz w:val="24"/>
+          <w:szCs w:val="24"/>
+        </w:rPr>
+        <w:t>alud (OPS/OMS)</w:t>
       </w:r>
       <w:r>
         <w:rPr>
@@ -4335,7 +4584,7 @@
           <w:szCs w:val="24"/>
           <w:u w:val="single"/>
         </w:rPr>
-        <w:t>Planeación interinstitucional de entornos s</w:t>
+        <w:t>Planeación Interinstitucional de Entornos S</w:t>
       </w:r>
       <w:r>
         <w:rPr>
@@ -4708,7 +4957,6 @@
                 <w:sz w:val="24"/>
                 <w:szCs w:val="24"/>
               </w:rPr>
-              <w:lastRenderedPageBreak/>
               <w:t>Fase</w:t>
             </w:r>
           </w:p>
@@ -5397,15 +5645,7 @@
           <w:sz w:val="24"/>
           <w:szCs w:val="24"/>
         </w:rPr>
-        <w:t>. Plan de acción i</w:t>
-      </w:r>
-      <w:r>
-        <w:rPr>
-          <w:b/>
-          <w:sz w:val="24"/>
-          <w:szCs w:val="24"/>
-        </w:rPr>
-        <w:t>ntersectorial de entornos s</w:t>
+        <w:t>. Plan de Acción Intersectorial de Entornos S</w:t>
       </w:r>
       <w:r>
         <w:rPr>
@@ -5440,14 +5680,8 @@
           <w:sz w:val="24"/>
           <w:szCs w:val="24"/>
         </w:rPr>
-        <w:t>El Plan de acción i</w:t>
-      </w:r>
-      <w:r>
-        <w:rPr>
-          <w:sz w:val="24"/>
-          <w:szCs w:val="24"/>
-        </w:rPr>
-        <w:t>ntersectorial de entornos s</w:t>
+        <w:lastRenderedPageBreak/>
+        <w:t>El Plan de Acción Intersectorial de Entornos S</w:t>
       </w:r>
       <w:r>
         <w:rPr>
@@ -5470,15 +5704,7 @@
           <w:sz w:val="24"/>
           <w:szCs w:val="24"/>
         </w:rPr>
-        <w:t xml:space="preserve"> y sanitarias de </w:t>
-      </w:r>
-      <w:r>
-        <w:rPr>
-          <w:sz w:val="24"/>
-          <w:szCs w:val="24"/>
-        </w:rPr>
-        <w:lastRenderedPageBreak/>
-        <w:t xml:space="preserve">los diferentes entornos en los que las personas desarrollan su vida cotidiana, tales como la vivienda, la escuela y los lugares de trabajo. </w:t>
+        <w:t xml:space="preserve"> y sanitarias de los diferentes entornos en los que las personas desarrollan su vida cotidiana, tales como la vivienda, la escuela y los lugares de trabajo. </w:t>
       </w:r>
     </w:p>
     <w:p>
@@ -5605,7 +5831,7 @@
           <w:sz w:val="24"/>
           <w:szCs w:val="24"/>
         </w:rPr>
-        <w:t>ra su adecuada formulación, el consejo territorial de salud a</w:t>
+        <w:t>ra su adecuada formulación, el Consejo Territorial de Salud A</w:t>
       </w:r>
       <w:r>
         <w:rPr>
@@ -5808,7 +6034,15 @@
           <w:sz w:val="24"/>
           <w:szCs w:val="24"/>
         </w:rPr>
-        <w:t>demás, se requiere la identificación de vacíos en la información existente, así como de las limitaciones en la capacidad operativa y técnica de las instituciones encargadas de implementar las acciones, lo que permitirá orientar los esfuerzos hacia el fortalecimiento institucional y la adecuada gestión de los recursos disponibles.</w:t>
+        <w:t xml:space="preserve">demás, se requiere la identificación de vacíos en la información existente, así como de las limitaciones en la capacidad operativa y técnica de las </w:t>
+      </w:r>
+      <w:r>
+        <w:rPr>
+          <w:sz w:val="24"/>
+          <w:szCs w:val="24"/>
+        </w:rPr>
+        <w:lastRenderedPageBreak/>
+        <w:t>instituciones encargadas de implementar las acciones, lo que permitirá orientar los esfuerzos hacia el fortalecimiento institucional y la adecuada gestión de los recursos disponibles.</w:t>
       </w:r>
     </w:p>
     <w:p>
@@ -5841,7 +6075,6 @@
           <w:szCs w:val="24"/>
           <w:u w:val="single"/>
         </w:rPr>
-        <w:lastRenderedPageBreak/>
         <w:t>Fase de e</w:t>
       </w:r>
       <w:r>
@@ -6078,14 +6311,28 @@
           <w:sz w:val="24"/>
           <w:szCs w:val="24"/>
         </w:rPr>
-        <w:t>mundial de la salud (OMS) y la O</w:t>
-      </w:r>
-      <w:r>
-        <w:rPr>
-          <w:sz w:val="24"/>
-          <w:szCs w:val="24"/>
-        </w:rPr>
-        <w:t>rganización panamericana de la salud (OPS), el plan de acción integral para entornos saludables (PAIES) debe incorporar los siguientes elementos fundamentales para garantizar su efectividad y sostenibilidad:</w:t>
+        <w:t>Mundial de la S</w:t>
+      </w:r>
+      <w:r>
+        <w:rPr>
+          <w:sz w:val="24"/>
+          <w:szCs w:val="24"/>
+        </w:rPr>
+        <w:t>alud (OMS) y la O</w:t>
+      </w:r>
+      <w:r>
+        <w:rPr>
+          <w:sz w:val="24"/>
+          <w:szCs w:val="24"/>
+        </w:rPr>
+        <w:t>rganización Panamericana de la Salud (OPS), el Plan de Acción Integral para Entornos S</w:t>
+      </w:r>
+      <w:r>
+        <w:rPr>
+          <w:sz w:val="24"/>
+          <w:szCs w:val="24"/>
+        </w:rPr>
+        <w:t>aludables (PAIES) debe incorporar los siguientes elementos fundamentales para garantizar su efectividad y sostenibilidad:</w:t>
       </w:r>
     </w:p>
     <w:p>
@@ -6170,7 +6417,6 @@
           <w:sz w:val="24"/>
           <w:szCs w:val="24"/>
         </w:rPr>
-        <w:lastRenderedPageBreak/>
         <w:t>Información general sobre las características geográficas, así como la definición de los sectores económicos y sociales presentes en la zona, prestando especial atención a las condiciones de vulnerabilidad de la población.</w:t>
       </w:r>
     </w:p>
@@ -6889,7 +7135,25 @@
           <w:szCs w:val="24"/>
           <w:u w:val="single"/>
         </w:rPr>
-        <w:t>Indicadores a monitorear para la evaluación de la estrategia de entornos saludables (EES)</w:t>
+        <w:t>Indicadores a monit</w:t>
+      </w:r>
+      <w:r>
+        <w:rPr>
+          <w:b/>
+          <w:sz w:val="24"/>
+          <w:szCs w:val="24"/>
+          <w:u w:val="single"/>
+        </w:rPr>
+        <w:t>orear para la evaluación de la Estrategia de Entornos S</w:t>
+      </w:r>
+      <w:r>
+        <w:rPr>
+          <w:b/>
+          <w:sz w:val="24"/>
+          <w:szCs w:val="24"/>
+          <w:u w:val="single"/>
+        </w:rPr>
+        <w:t>aludables (EES)</w:t>
       </w:r>
     </w:p>
     <w:p>
@@ -7002,7 +7266,7 @@
           <w:sz w:val="24"/>
           <w:szCs w:val="24"/>
         </w:rPr>
-        <w:t>artamento que han desarrollado programas de acción integral en entornos s</w:t>
+        <w:t>artamento que han desarrollado Programas de Acción Integral en Entornos S</w:t>
       </w:r>
       <w:r>
         <w:rPr>
@@ -7364,7 +7628,23 @@
           <w:sz w:val="24"/>
           <w:szCs w:val="24"/>
         </w:rPr>
-        <w:t>terización y seguimiento de la estrategia de entornos s</w:t>
+        <w:t>terización y seguimiento de la E</w:t>
+      </w:r>
+      <w:r>
+        <w:rPr>
+          <w:b/>
+          <w:sz w:val="24"/>
+          <w:szCs w:val="24"/>
+        </w:rPr>
+        <w:t>s</w:t>
+      </w:r>
+      <w:r>
+        <w:rPr>
+          <w:b/>
+          <w:sz w:val="24"/>
+          <w:szCs w:val="24"/>
+        </w:rPr>
+        <w:t>trategia de Entornos S</w:t>
       </w:r>
       <w:r>
         <w:rPr>
@@ -7398,7 +7678,7 @@
           <w:sz w:val="24"/>
           <w:szCs w:val="24"/>
         </w:rPr>
-        <w:t>La organización mundial de la salud (OMS) y la o</w:t>
+        <w:t>La Organización Mundial de la Salud (OMS) y la O</w:t>
       </w:r>
       <w:r>
         <w:rPr>
@@ -7412,7 +7692,7 @@
           <w:sz w:val="24"/>
           <w:szCs w:val="24"/>
         </w:rPr>
-        <w:t>panamericana de la s</w:t>
+        <w:t>Panamericana de la S</w:t>
       </w:r>
       <w:r>
         <w:rPr>
@@ -7440,7 +7720,14 @@
           <w:sz w:val="24"/>
           <w:szCs w:val="24"/>
         </w:rPr>
-        <w:t xml:space="preserve"> uno de los subprogramas de la estrategia de entornos s</w:t>
+        <w:t xml:space="preserve"> uno de los subpr</w:t>
+      </w:r>
+      <w:r>
+        <w:rPr>
+          <w:sz w:val="24"/>
+          <w:szCs w:val="24"/>
+        </w:rPr>
+        <w:t>ogramas de la Estrategia de Entornos S</w:t>
       </w:r>
       <w:r>
         <w:rPr>
@@ -7492,7 +7779,23 @@
           <w:sz w:val="24"/>
           <w:szCs w:val="24"/>
         </w:rPr>
-        <w:t xml:space="preserve">Sistema de caracterización comunitaria para la estrategia de viviendas saludables (EVS): </w:t>
+        <w:t>Sistema de carac</w:t>
+      </w:r>
+      <w:r>
+        <w:rPr>
+          <w:b/>
+          <w:sz w:val="24"/>
+          <w:szCs w:val="24"/>
+        </w:rPr>
+        <w:t>terización comunitaria para la Estrategia de Viviendas S</w:t>
+      </w:r>
+      <w:r>
+        <w:rPr>
+          <w:b/>
+          <w:sz w:val="24"/>
+          <w:szCs w:val="24"/>
+        </w:rPr>
+        <w:t xml:space="preserve">aludables (EVS): </w:t>
       </w:r>
       <w:r>
         <w:rPr>
@@ -7538,7 +7841,15 @@
           <w:sz w:val="24"/>
           <w:szCs w:val="24"/>
         </w:rPr>
-        <w:t>Sistema de caracterización institucional para la estrategia de escuelas s</w:t>
+        <w:t>Sistema de caracte</w:t>
+      </w:r>
+      <w:r>
+        <w:rPr>
+          <w:b/>
+          <w:sz w:val="24"/>
+          <w:szCs w:val="24"/>
+        </w:rPr>
+        <w:t>rización institucional para la Estrategia de Escuelas S</w:t>
       </w:r>
       <w:r>
         <w:rPr>
@@ -7599,7 +7910,23 @@
           <w:sz w:val="24"/>
           <w:szCs w:val="24"/>
         </w:rPr>
-        <w:t>Sistema de caracterización laboral para la estrategia de lugares de trabajo saludables (ELTS):</w:t>
+        <w:t>Sistema de c</w:t>
+      </w:r>
+      <w:r>
+        <w:rPr>
+          <w:b/>
+          <w:sz w:val="24"/>
+          <w:szCs w:val="24"/>
+        </w:rPr>
+        <w:t>aracterización laboral para la Estrategia de Lugares de Trabajo S</w:t>
+      </w:r>
+      <w:r>
+        <w:rPr>
+          <w:b/>
+          <w:sz w:val="24"/>
+          <w:szCs w:val="24"/>
+        </w:rPr>
+        <w:t>aludables (ELTS):</w:t>
       </w:r>
       <w:r>
         <w:rPr>
@@ -8150,7 +8477,7 @@
           <w:sz w:val="24"/>
           <w:szCs w:val="24"/>
         </w:rPr>
-        <w:t>a e</w:t>
+        <w:t>a E</w:t>
       </w:r>
       <w:r>
         <w:rPr>
@@ -8164,7 +8491,14 @@
           <w:sz w:val="24"/>
           <w:szCs w:val="24"/>
         </w:rPr>
-        <w:t xml:space="preserve"> de entornos saludables (EES), e</w:t>
+        <w:t xml:space="preserve"> de Entornos S</w:t>
+      </w:r>
+      <w:r>
+        <w:rPr>
+          <w:sz w:val="24"/>
+          <w:szCs w:val="24"/>
+        </w:rPr>
+        <w:t>aludables (EES), e</w:t>
       </w:r>
       <w:r>
         <w:rPr>
@@ -8488,7 +8822,14 @@
           <w:sz w:val="24"/>
           <w:szCs w:val="24"/>
         </w:rPr>
-        <w:t>rganización mundial de la salud (OMS) y la organización panamericana de la salud (OPS) (2009)</w:t>
+        <w:t>rganización Mundial de la Salud (OMS) y la Organización Panamericana de la S</w:t>
+      </w:r>
+      <w:r>
+        <w:rPr>
+          <w:sz w:val="24"/>
+          <w:szCs w:val="24"/>
+        </w:rPr>
+        <w:t>alud (OPS) (2009)</w:t>
       </w:r>
       <w:r>
         <w:rPr>
@@ -9362,8 +9703,6 @@
         </w:rPr>
         <w:t>scolar:</w:t>
       </w:r>
-      <w:bookmarkStart w:id="6" w:name="_GoBack"/>
-      <w:bookmarkEnd w:id="6"/>
     </w:p>
     <w:p>
       <w:pPr>
@@ -9652,7 +9991,14 @@
           <w:sz w:val="24"/>
           <w:szCs w:val="24"/>
         </w:rPr>
-        <w:t>para la adecuada gestión de la estrategia de entornos saludables (EES); a</w:t>
+        <w:t>para la adecuada gestión de la Estrategia de Entornos S</w:t>
+      </w:r>
+      <w:r>
+        <w:rPr>
+          <w:sz w:val="24"/>
+          <w:szCs w:val="24"/>
+        </w:rPr>
+        <w:t>aludables (EES); a</w:t>
       </w:r>
       <w:r>
         <w:rPr>
@@ -9732,7 +10078,10 @@
         <w:t>ntervención y evaluación en entornos saludables busca fortalecer la calidad de vida mediante acciones integral</w:t>
       </w:r>
       <w:r>
-        <w:t>es en escuelas y comunidades, a través de la estrategia de entornos saludables (EES) y los planes de acción i</w:t>
+        <w:t>es en escuelas</w:t>
+      </w:r>
+      <w:r>
+        <w:t xml:space="preserve"> y comunidades, a través de la Estrategia de Entornos Saludables (EES) y los Planes de Acción I</w:t>
       </w:r>
       <w:r>
         <w:t xml:space="preserve">ntersectorial (PAIES), se promueve la creación de escuelas saludables y el mejoramiento de las condiciones </w:t>
@@ -9827,7 +10176,7 @@
         <w:rPr>
           <w:rStyle w:val="Refdecomentario"/>
         </w:rPr>
-        <w:commentReference w:id="7"/>
+        <w:commentReference w:id="6"/>
       </w:r>
     </w:p>
     <w:p>
@@ -10273,30 +10622,14 @@
                 <w:sz w:val="22"/>
                 <w:szCs w:val="22"/>
               </w:rPr>
-              <w:t xml:space="preserve">Herramientas para la caracterización y seguimiento de las condiciones </w:t>
+              <w:t>Directrices para la caracterización y seguimiento de la estrategia de entornos saludables (EES)</w:t>
             </w:r>
-            <w:proofErr w:type="spellStart"/>
             <w:r>
               <w:rPr>
                 <w:sz w:val="22"/>
                 <w:szCs w:val="22"/>
               </w:rPr>
-              <w:t>socioambiental</w:t>
-            </w:r>
-            <w:r>
-              <w:rPr>
-                <w:sz w:val="22"/>
-                <w:szCs w:val="22"/>
-              </w:rPr>
-              <w:t>es</w:t>
-            </w:r>
-            <w:proofErr w:type="spellEnd"/>
-            <w:r>
-              <w:rPr>
-                <w:sz w:val="22"/>
-                <w:szCs w:val="22"/>
-              </w:rPr>
-              <w:t xml:space="preserve"> y sanitarias de los entornos.</w:t>
+              <w:t>.</w:t>
             </w:r>
           </w:p>
         </w:tc>
@@ -10427,7 +10760,6 @@
               <w:pStyle w:val="Ttulo1"/>
               <w:outlineLvl w:val="0"/>
               <w:rPr>
-                <w:b w:val="0"/>
                 <w:bCs/>
                 <w:sz w:val="22"/>
                 <w:szCs w:val="22"/>
@@ -10439,15 +10771,7 @@
                 <w:sz w:val="22"/>
                 <w:szCs w:val="22"/>
               </w:rPr>
-              <w:t>Evaluación de la política pública de escuela saludable en Colombia: fase de formulación (1999-2006)</w:t>
-            </w:r>
-            <w:r>
-              <w:rPr>
-                <w:bCs/>
-                <w:sz w:val="22"/>
-                <w:szCs w:val="22"/>
-              </w:rPr>
-              <w:t>.</w:t>
+              <w:t>Estructura general para la implementación de la estrategia de entornos saludables (EES).</w:t>
             </w:r>
           </w:p>
         </w:tc>
@@ -13157,13 +13481,31 @@
         <w:t>Texto alternativo: d</w:t>
       </w:r>
       <w:r>
-        <w:t>iagrama general de la implementación de la estrategia de entornos saludable</w:t>
+        <w:t>iagrama gene</w:t>
+      </w:r>
+      <w:r>
+        <w:t>ral de la implementación de la Estrategia de Entornos S</w:t>
+      </w:r>
+      <w:r>
+        <w:t>aludable</w:t>
       </w:r>
       <w:r>
         <w:t>s (EES) en Colombia, que describe</w:t>
       </w:r>
       <w:r>
-        <w:t xml:space="preserve"> la estructura del comité técnico nacional, la planeación interinstitucional (PAIES), y las fases de diagnóstico, elaboración, implementación, evaluación y supervisión, con participación comunitaria y redes de vivienda, escuela y lugares de trabajo saludables.</w:t>
+        <w:t xml:space="preserve"> la estructura d</w:t>
+      </w:r>
+      <w:r>
+        <w:t>el comité técnico nacional, la P</w:t>
+      </w:r>
+      <w:r>
+        <w:t>la</w:t>
+      </w:r>
+      <w:r>
+        <w:t>neación I</w:t>
+      </w:r>
+      <w:r>
+        <w:t>nterinstitucional (PAIES), y las fases de diagnóstico, elaboración, implementación, evaluación y supervisión, con participación comunitaria y redes de vivienda, escuela y lugares de trabajo saludables.</w:t>
       </w:r>
     </w:p>
     <w:p>
@@ -13188,7 +13530,7 @@
       </w:r>
     </w:p>
   </w:comment>
-  <w:comment w:id="7" w:author="LauraPGM" w:date="2025-03-13T15:22:00Z" w:initials="L">
+  <w:comment w:id="6" w:author="LauraPGM" w:date="2025-03-13T15:22:00Z" w:initials="L">
     <w:p>
       <w:pPr>
         <w:pStyle w:val="Textocomentario"/>
@@ -13200,7 +13542,12 @@
         <w:annotationRef/>
       </w:r>
       <w:r>
-        <w:t>Texto alternativo: Diagrama sobre la intervención y evaluación en entornos saludables, que resume la estrategia de escuelas saludables, la evaluación de la estrategia de entornos saludables (EES), los elementos que debe incluir el PAIES según la OMS/OPS, y las directrices para la caracterización y seguimiento de la estrategia de entornos saludables.</w:t>
+        <w:t>Texto alternativo: Diagrama sobre la intervención y evaluación en entornos saludables, que resume la estrategia de escuelas saludables, la evaluación de la estrategia de entornos s</w:t>
+      </w:r>
+      <w:bookmarkStart w:id="7" w:name="_GoBack"/>
+      <w:bookmarkEnd w:id="7"/>
+      <w:r>
+        <w:t>aludables (EES), los elementos que debe incluir el PAIES según la OMS/OPS, y las directrices para la caracterización y seguimiento de la estrategia de entornos saludables.</w:t>
       </w:r>
     </w:p>
   </w:comment>
@@ -22185,6 +22532,32 @@
 </file>
 
 <file path=customXml/item1.xml><?xml version="1.0" encoding="utf-8"?>
+<p:properties xmlns:p="http://schemas.microsoft.com/office/2006/metadata/properties" xmlns:xsi="http://www.w3.org/2001/XMLSchema-instance" xmlns:pc="http://schemas.microsoft.com/office/infopath/2007/PartnerControls">
+  <documentManagement>
+    <TaxCatchAll xmlns="cb45339b-ced9-4d0d-8f64-77573914d53b" xsi:nil="true"/>
+    <lcf76f155ced4ddcb4097134ff3c332f xmlns="43a3ca16-9c26-4813-b83f-4aec9927b43f">
+      <Terms xmlns="http://schemas.microsoft.com/office/infopath/2007/PartnerControls"/>
+    </lcf76f155ced4ddcb4097134ff3c332f>
+  </documentManagement>
+</p:properties>
+</file>
+
+<file path=customXml/item2.xml><?xml version="1.0" encoding="utf-8"?>
+<go:gDocsCustomXmlDataStorage xmlns:go="http://customooxmlschemas.google.com/" xmlns:r="http://schemas.openxmlformats.org/officeDocument/2006/relationships">
+  <go:docsCustomData xmlns:go="http://customooxmlschemas.google.com/" roundtripDataSignature="AMtx7mh3w1sXrKwdjzYCxjbwPkf7wsIk5w==">AMUW2mWhRc/xLonLdtoI8dz4BVu2GREgE7++Eme5Ko+W5/2G+QfXPKxV7NwLPPaJ77IM2LrlHDguxVZnDKcg4iQIvJIe+zJ9DBWjUaWFI+z0k4HbdiCFsJo=</go:docsCustomData>
+</go:gDocsCustomXmlDataStorage>
+</file>
+
+<file path=customXml/item3.xml><?xml version="1.0" encoding="utf-8"?>
+<?mso-contentType ?>
+<FormTemplates xmlns="http://schemas.microsoft.com/sharepoint/v3/contenttype/forms">
+  <Display>DocumentLibraryForm</Display>
+  <Edit>DocumentLibraryForm</Edit>
+  <New>DocumentLibraryForm</New>
+</FormTemplates>
+</file>
+
+<file path=customXml/item4.xml><?xml version="1.0" encoding="utf-8"?>
 <ct:contentTypeSchema xmlns:ct="http://schemas.microsoft.com/office/2006/metadata/contentType" xmlns:ma="http://schemas.microsoft.com/office/2006/metadata/properties/metaAttributes" ct:_="" ma:_="" ma:contentTypeName="Documento" ma:contentTypeID="0x01010049282E1EDBE9234EA9E6D38F720E265F" ma:contentTypeVersion="15" ma:contentTypeDescription="Crear nuevo documento." ma:contentTypeScope="" ma:versionID="b31c7aa9eaf043a08b87120b3c4916e3">
   <xsd:schema xmlns:xsd="http://www.w3.org/2001/XMLSchema" xmlns:xs="http://www.w3.org/2001/XMLSchema" xmlns:p="http://schemas.microsoft.com/office/2006/metadata/properties" xmlns:ns2="cb45339b-ced9-4d0d-8f64-77573914d53b" xmlns:ns3="43a3ca16-9c26-4813-b83f-4aec9927b43f" targetNamespace="http://schemas.microsoft.com/office/2006/metadata/properties" ma:root="true" ma:fieldsID="3533d065b04d75c457075bc55f1f5315" ns2:_="" ns3:_="">
     <xsd:import namespace="cb45339b-ced9-4d0d-8f64-77573914d53b"/>
@@ -22419,37 +22792,7 @@
 </ct:contentTypeSchema>
 </file>
 
-<file path=customXml/item2.xml><?xml version="1.0" encoding="utf-8"?>
-<p:properties xmlns:p="http://schemas.microsoft.com/office/2006/metadata/properties" xmlns:xsi="http://www.w3.org/2001/XMLSchema-instance" xmlns:pc="http://schemas.microsoft.com/office/infopath/2007/PartnerControls">
-  <documentManagement>
-    <TaxCatchAll xmlns="cb45339b-ced9-4d0d-8f64-77573914d53b" xsi:nil="true"/>
-    <lcf76f155ced4ddcb4097134ff3c332f xmlns="43a3ca16-9c26-4813-b83f-4aec9927b43f">
-      <Terms xmlns="http://schemas.microsoft.com/office/infopath/2007/PartnerControls"/>
-    </lcf76f155ced4ddcb4097134ff3c332f>
-  </documentManagement>
-</p:properties>
-</file>
-
-<file path=customXml/item3.xml><?xml version="1.0" encoding="utf-8"?>
-<go:gDocsCustomXmlDataStorage xmlns:go="http://customooxmlschemas.google.com/" xmlns:r="http://schemas.openxmlformats.org/officeDocument/2006/relationships">
-  <go:docsCustomData xmlns:go="http://customooxmlschemas.google.com/" roundtripDataSignature="AMtx7mh3w1sXrKwdjzYCxjbwPkf7wsIk5w==">AMUW2mWhRc/xLonLdtoI8dz4BVu2GREgE7++Eme5Ko+W5/2G+QfXPKxV7NwLPPaJ77IM2LrlHDguxVZnDKcg4iQIvJIe+zJ9DBWjUaWFI+z0k4HbdiCFsJo=</go:docsCustomData>
-</go:gDocsCustomXmlDataStorage>
-</file>
-
-<file path=customXml/item4.xml><?xml version="1.0" encoding="utf-8"?>
-<?mso-contentType ?>
-<FormTemplates xmlns="http://schemas.microsoft.com/sharepoint/v3/contenttype/forms">
-  <Display>DocumentLibraryForm</Display>
-  <Edit>DocumentLibraryForm</Edit>
-  <New>DocumentLibraryForm</New>
-</FormTemplates>
-</file>
-
 <file path=customXml/itemProps1.xml><?xml version="1.0" encoding="utf-8"?>
-<ds:datastoreItem xmlns:ds="http://schemas.openxmlformats.org/officeDocument/2006/customXml" ds:itemID="{286C2542-83E3-4156-8B2D-755C13D5D131}"/>
-</file>
-
-<file path=customXml/itemProps2.xml><?xml version="1.0" encoding="utf-8"?>
 <ds:datastoreItem xmlns:ds="http://schemas.openxmlformats.org/officeDocument/2006/customXml" ds:itemID="{9D9B1A75-0210-4935-8179-95DF20A26AD1}">
   <ds:schemaRefs>
     <ds:schemaRef ds:uri="http://schemas.microsoft.com/office/2006/metadata/properties"/>
@@ -22460,7 +22803,7 @@
 </ds:datastoreItem>
 </file>
 
-<file path=customXml/itemProps3.xml><?xml version="1.0" encoding="utf-8"?>
+<file path=customXml/itemProps2.xml><?xml version="1.0" encoding="utf-8"?>
 <ds:datastoreItem xmlns:ds="http://schemas.openxmlformats.org/officeDocument/2006/customXml" ds:itemID="{11111111-1234-1234-1234-123412341234}">
   <ds:schemaRefs>
     <ds:schemaRef ds:uri="http://customooxmlschemas.google.com/"/>
@@ -22469,10 +22812,14 @@
 </ds:datastoreItem>
 </file>
 
-<file path=customXml/itemProps4.xml><?xml version="1.0" encoding="utf-8"?>
+<file path=customXml/itemProps3.xml><?xml version="1.0" encoding="utf-8"?>
 <ds:datastoreItem xmlns:ds="http://schemas.openxmlformats.org/officeDocument/2006/customXml" ds:itemID="{83102ECF-E44F-4F73-A78F-FE313D1BFB9A}">
   <ds:schemaRefs>
     <ds:schemaRef ds:uri="http://schemas.microsoft.com/sharepoint/v3/contenttype/forms"/>
   </ds:schemaRefs>
 </ds:datastoreItem>
+</file>
+
+<file path=customXml/itemProps4.xml><?xml version="1.0" encoding="utf-8"?>
+<ds:datastoreItem xmlns:ds="http://schemas.openxmlformats.org/officeDocument/2006/customXml" ds:itemID="{C0FD4F76-C96C-43EB-A8E9-F8C59B3E49E4}"/>
 </file>
</xml_diff>

<commit_message>
[FIX] Validacion REPO 1.0
</commit_message>
<xml_diff>
--- a/fuentes/CF2_41730034_DI.docx
+++ b/fuentes/CF2_41730034_DI.docx
@@ -3441,23 +3441,7 @@
           <w:sz w:val="24"/>
           <w:szCs w:val="24"/>
         </w:rPr>
-        <w:t xml:space="preserve">Implementar estrategias y acciones concretas que promuevan la salud y mejoren las condiciones </w:t>
-      </w:r>
-      <w:proofErr w:type="spellStart"/>
-      <w:r>
-        <w:rPr>
-          <w:sz w:val="24"/>
-          <w:szCs w:val="24"/>
-        </w:rPr>
-        <w:t>socioambientales</w:t>
-      </w:r>
-      <w:proofErr w:type="spellEnd"/>
-      <w:r>
-        <w:rPr>
-          <w:sz w:val="24"/>
-          <w:szCs w:val="24"/>
-        </w:rPr>
-        <w:t xml:space="preserve"> de los entornos.</w:t>
+        <w:t>Implementar estrategias y acciones concretas que promuevan la salud y mejoren las condiciones socioambientales de los entornos.</w:t>
       </w:r>
     </w:p>
     <w:p>
@@ -5688,23 +5672,7 @@
           <w:sz w:val="24"/>
           <w:szCs w:val="24"/>
         </w:rPr>
-        <w:t xml:space="preserve">aludables (PAIES) es un instrumento de gestión intersectorial que tiene como propósito fundamental orientar, articular y fortalecer los programas y acciones destinadas a mejorar las condiciones </w:t>
-      </w:r>
-      <w:proofErr w:type="spellStart"/>
-      <w:r>
-        <w:rPr>
-          <w:sz w:val="24"/>
-          <w:szCs w:val="24"/>
-        </w:rPr>
-        <w:t>socioambientales</w:t>
-      </w:r>
-      <w:proofErr w:type="spellEnd"/>
-      <w:r>
-        <w:rPr>
-          <w:sz w:val="24"/>
-          <w:szCs w:val="24"/>
-        </w:rPr>
-        <w:t xml:space="preserve"> y sanitarias de los diferentes entornos en los que las personas desarrollan su vida cotidiana, tales como la vivienda, la escuela y los lugares de trabajo. </w:t>
+        <w:t xml:space="preserve">aludables (PAIES) es un instrumento de gestión intersectorial que tiene como propósito fundamental orientar, articular y fortalecer los programas y acciones destinadas a mejorar las condiciones socioambientales y sanitarias de los diferentes entornos en los que las personas desarrollan su vida cotidiana, tales como la vivienda, la escuela y los lugares de trabajo. </w:t>
       </w:r>
     </w:p>
     <w:p>
@@ -5942,23 +5910,7 @@
           <w:sz w:val="24"/>
           <w:szCs w:val="24"/>
         </w:rPr>
-        <w:t xml:space="preserve">esgos </w:t>
-      </w:r>
-      <w:proofErr w:type="spellStart"/>
-      <w:r>
-        <w:rPr>
-          <w:sz w:val="24"/>
-          <w:szCs w:val="24"/>
-        </w:rPr>
-        <w:t>socioambientales</w:t>
-      </w:r>
-      <w:proofErr w:type="spellEnd"/>
-      <w:r>
-        <w:rPr>
-          <w:sz w:val="24"/>
-          <w:szCs w:val="24"/>
-        </w:rPr>
-        <w:t xml:space="preserve">. </w:t>
+        <w:t xml:space="preserve">esgos socioambientales. </w:t>
       </w:r>
     </w:p>
     <w:p>
@@ -6004,23 +5956,7 @@
           <w:sz w:val="24"/>
           <w:szCs w:val="24"/>
         </w:rPr>
-        <w:t xml:space="preserve">entro de este proceso, es fundamental también llevar a cabo una evaluación de las condiciones sanitarias y </w:t>
-      </w:r>
-      <w:proofErr w:type="spellStart"/>
-      <w:r>
-        <w:rPr>
-          <w:sz w:val="24"/>
-          <w:szCs w:val="24"/>
-        </w:rPr>
-        <w:t>socioambientales</w:t>
-      </w:r>
-      <w:proofErr w:type="spellEnd"/>
-      <w:r>
-        <w:rPr>
-          <w:sz w:val="24"/>
-          <w:szCs w:val="24"/>
-        </w:rPr>
-        <w:t xml:space="preserve"> de los diferentes entornos, incluyendo la vivienda, las instituciones educativas y los espacios laborales, para identificar los principale</w:t>
+        <w:t>entro de este proceso, es fundamental también llevar a cabo una evaluación de las condiciones sanitarias y socioambientales de los diferentes entornos, incluyendo la vivienda, las instituciones educativas y los espacios laborales, para identificar los principale</w:t>
       </w:r>
       <w:r>
         <w:rPr>
@@ -6563,7 +6499,21 @@
           <w:sz w:val="24"/>
           <w:szCs w:val="24"/>
         </w:rPr>
-        <w:t>Orientarse a la transformación de los entornos socio-ambientales y a la mejora de la calidad de vida de la población, promoviendo el desarrollo sostenible y la equidad en salud.</w:t>
+        <w:t>Orientarse a la trans</w:t>
+      </w:r>
+      <w:r>
+        <w:rPr>
+          <w:sz w:val="24"/>
+          <w:szCs w:val="24"/>
+        </w:rPr>
+        <w:t>formación de los entornos socio</w:t>
+      </w:r>
+      <w:r>
+        <w:rPr>
+          <w:sz w:val="24"/>
+          <w:szCs w:val="24"/>
+        </w:rPr>
+        <w:t>ambientales y a la mejora de la calidad de vida de la población, promoviendo el desarrollo sostenible y la equidad en salud.</w:t>
       </w:r>
     </w:p>
     <w:p>
@@ -6795,21 +6745,7 @@
           <w:sz w:val="24"/>
           <w:szCs w:val="24"/>
         </w:rPr>
-        <w:t>La identificación y diseño de acciones específicas para establecer o fortalecer programas dirigidos a la caracterización y seguimiento de las condiciones socio</w:t>
-      </w:r>
-      <w:r>
-        <w:rPr>
-          <w:sz w:val="24"/>
-          <w:szCs w:val="24"/>
-        </w:rPr>
-        <w:t>-</w:t>
-      </w:r>
-      <w:r>
-        <w:rPr>
-          <w:sz w:val="24"/>
-          <w:szCs w:val="24"/>
-        </w:rPr>
-        <w:t>ambientales y sanitarias de los entornos.</w:t>
+        <w:t>La identificación y diseño de acciones específicas para establecer o fortalecer programas dirigidos a la caracterización y seguimiento de las condiciones socioambientales y sanitarias de los entornos.</w:t>
       </w:r>
     </w:p>
     <w:p>
@@ -7308,25 +7244,7 @@
           <w:u w:val="single"/>
         </w:rPr>
         <w:lastRenderedPageBreak/>
-        <w:t>Indicadores para evaluar los programas de caracterización y seguimiento de las condiciones socio</w:t>
-      </w:r>
-      <w:r>
-        <w:rPr>
-          <w:b/>
-          <w:sz w:val="24"/>
-          <w:szCs w:val="24"/>
-          <w:u w:val="single"/>
-        </w:rPr>
-        <w:t>-</w:t>
-      </w:r>
-      <w:r>
-        <w:rPr>
-          <w:b/>
-          <w:sz w:val="24"/>
-          <w:szCs w:val="24"/>
-          <w:u w:val="single"/>
-        </w:rPr>
-        <w:t>ambientales y sanitarias del entorno</w:t>
+        <w:t>Indicadores para evaluar los programas de caracterización y seguimiento de las condiciones socioambientales y sanitarias del entorno</w:t>
       </w:r>
     </w:p>
     <w:p>
@@ -7378,30 +7296,7 @@
           <w:sz w:val="24"/>
           <w:szCs w:val="24"/>
         </w:rPr>
-        <w:t>Número de diagnósticos integrales realizados para evaluar las condiciones socio</w:t>
-      </w:r>
-      <w:r>
-        <w:rPr>
-          <w:sz w:val="24"/>
-          <w:szCs w:val="24"/>
-        </w:rPr>
-        <w:t xml:space="preserve">- </w:t>
-      </w:r>
-      <w:proofErr w:type="gramStart"/>
-      <w:r>
-        <w:rPr>
-          <w:sz w:val="24"/>
-          <w:szCs w:val="24"/>
-        </w:rPr>
-        <w:t>ambientales y sanitarias</w:t>
-      </w:r>
-      <w:proofErr w:type="gramEnd"/>
-      <w:r>
-        <w:rPr>
-          <w:sz w:val="24"/>
-          <w:szCs w:val="24"/>
-        </w:rPr>
-        <w:t xml:space="preserve"> del entorno, incluyendo acceso a servicios básicos, manejo de residuos, condiciones de infraestructura, y factores de riesgo ambiental.</w:t>
+        <w:t>Número de diagnósticos integrales realizados para evaluar las condiciones socioambientales y sanitarias del entorno, incluyendo acceso a servicios básicos, manejo de residuos, condiciones de infraestructura, y factores de riesgo ambiental.</w:t>
       </w:r>
     </w:p>
     <w:p>
@@ -7444,25 +7339,7 @@
           <w:szCs w:val="24"/>
           <w:u w:val="single"/>
         </w:rPr>
-        <w:t>Indicadores para evaluar el desarrollo de acciones integrales intersectoriales para la mejora de las condiciones socio</w:t>
-      </w:r>
-      <w:r>
-        <w:rPr>
-          <w:b/>
-          <w:sz w:val="24"/>
-          <w:szCs w:val="24"/>
-          <w:u w:val="single"/>
-        </w:rPr>
-        <w:t>-</w:t>
-      </w:r>
-      <w:r>
-        <w:rPr>
-          <w:b/>
-          <w:sz w:val="24"/>
-          <w:szCs w:val="24"/>
-          <w:u w:val="single"/>
-        </w:rPr>
-        <w:t>ambientales y sanitarias del entorno</w:t>
+        <w:t>Indicadores para evaluar el desarrollo de acciones integrales intersectoriales para la mejora de las condiciones socioambientales y sanitarias del entorno</w:t>
       </w:r>
     </w:p>
     <w:p>
@@ -7699,21 +7576,7 @@
           <w:sz w:val="24"/>
           <w:szCs w:val="24"/>
         </w:rPr>
-        <w:t>alud (OPS) (2009) establecieron que para una adecuada gestión de las condiciones socio</w:t>
-      </w:r>
-      <w:r>
-        <w:rPr>
-          <w:sz w:val="24"/>
-          <w:szCs w:val="24"/>
-        </w:rPr>
-        <w:t xml:space="preserve">- </w:t>
-      </w:r>
-      <w:r>
-        <w:rPr>
-          <w:sz w:val="24"/>
-          <w:szCs w:val="24"/>
-        </w:rPr>
-        <w:t>ambientales y sanitarias en cada</w:t>
+        <w:t>alud (OPS) (2009) establecieron que para una adecuada gestión de las condiciones socioambientales y sanitarias en cada</w:t>
       </w:r>
       <w:r>
         <w:rPr>
@@ -10084,15 +9947,7 @@
         <w:t xml:space="preserve"> y comunidades, a través de la Estrategia de Entornos Saludables (EES) y los Planes de Acción I</w:t>
       </w:r>
       <w:r>
-        <w:t xml:space="preserve">ntersectorial (PAIES), se promueve la creación de escuelas saludables y el mejoramiento de las condiciones </w:t>
-      </w:r>
-      <w:proofErr w:type="spellStart"/>
-      <w:r>
-        <w:t>socioambientales</w:t>
-      </w:r>
-      <w:proofErr w:type="spellEnd"/>
-      <w:r>
-        <w:t xml:space="preserve"> y sanitari</w:t>
+        <w:t>ntersectorial (PAIES), se promueve la creación de escuelas saludables y el mejoramiento de las condiciones socioambientales y sanitari</w:t>
       </w:r>
       <w:r>
         <w:t>as, también s</w:t>
@@ -10656,23 +10511,7 @@
                 <w:sz w:val="22"/>
                 <w:szCs w:val="22"/>
               </w:rPr>
-              <w:t xml:space="preserve">Ministerio de Salud y Protección Social. (2016). Herramientas para la caracterización y seguimiento de las condiciones </w:t>
-            </w:r>
-            <w:proofErr w:type="spellStart"/>
-            <w:r>
-              <w:rPr>
-                <w:sz w:val="22"/>
-                <w:szCs w:val="22"/>
-              </w:rPr>
-              <w:t>socioambientales</w:t>
-            </w:r>
-            <w:proofErr w:type="spellEnd"/>
-            <w:r>
-              <w:rPr>
-                <w:sz w:val="22"/>
-                <w:szCs w:val="22"/>
-              </w:rPr>
-              <w:t xml:space="preserve"> y sanitarias de los entornos (Documentos 06-07-16). Bogotá, Colombia: Ministerio de Salud y Protección Social.</w:t>
+              <w:t>Ministerio de Salud y Protección Social. (2016). Herramientas para la caracterización y seguimiento de las condiciones socioambientales y sanitarias de los entornos (Documentos 06-07-16). Bogotá, Colombia: Ministerio de Salud y Protección Social.</w:t>
             </w:r>
           </w:p>
         </w:tc>
@@ -10726,7 +10565,21 @@
                 <w:rPr>
                   <w:rStyle w:val="Hipervnculo"/>
                 </w:rPr>
-                <w:t>https://www.minsalud.gov.co/sites/rid/Lists/BibliotecaDigital/RIDE/VS/PP/SA/herramientas-para-caracterizacion-y-seguimiento-de-las-condiciones-socio-ambientales-y-sanitarias-de-los-entornos.pdf</w:t>
+                <w:t>https://www.minsalud.gov.co/sites/rid/Lists/BibliotecaDigital/RIDE/VS/PP/SA/herramientas-para-caracterizacion-y-seguimiento-de-las-condiciones-</w:t>
+              </w:r>
+              <w:bookmarkStart w:id="7" w:name="_GoBack"/>
+              <w:r>
+                <w:rPr>
+                  <w:rStyle w:val="Hipervnculo"/>
+                </w:rPr>
+                <w:t>socio</w:t>
+              </w:r>
+              <w:bookmarkEnd w:id="7"/>
+              <w:r>
+                <w:rPr>
+                  <w:rStyle w:val="Hipervnculo"/>
+                </w:rPr>
+                <w:t>-ambientales-y-sanitarias-de-los-entornos.pdf</w:t>
               </w:r>
             </w:hyperlink>
           </w:p>
@@ -11281,7 +11134,6 @@
                 <w:lang w:eastAsia="es-CO"/>
               </w:rPr>
             </w:pPr>
-            <w:proofErr w:type="gramStart"/>
             <w:r>
               <w:rPr>
                 <w:rFonts w:eastAsia="Times New Roman"/>
@@ -11290,38 +11142,7 @@
                 <w:szCs w:val="24"/>
                 <w:lang w:eastAsia="es-CO"/>
               </w:rPr>
-              <w:t>proceso</w:t>
-            </w:r>
-            <w:proofErr w:type="gramEnd"/>
-            <w:r>
-              <w:rPr>
-                <w:rFonts w:eastAsia="Times New Roman"/>
-                <w:color w:val="000000"/>
-                <w:sz w:val="24"/>
-                <w:szCs w:val="24"/>
-                <w:lang w:eastAsia="es-CO"/>
-              </w:rPr>
-              <w:t xml:space="preserve"> de diagnóstico integral de las condiciones socio</w:t>
-            </w:r>
-            <w:r>
-              <w:rPr>
-                <w:rFonts w:eastAsia="Times New Roman"/>
-                <w:color w:val="000000"/>
-                <w:sz w:val="24"/>
-                <w:szCs w:val="24"/>
-                <w:lang w:eastAsia="es-CO"/>
-              </w:rPr>
-              <w:t>-</w:t>
-            </w:r>
-            <w:r>
-              <w:rPr>
-                <w:rFonts w:eastAsia="Times New Roman"/>
-                <w:color w:val="000000"/>
-                <w:sz w:val="24"/>
-                <w:szCs w:val="24"/>
-                <w:lang w:eastAsia="es-CO"/>
-              </w:rPr>
-              <w:t>ambientales, educativas y sanitarias de un entorno, vivienda o escuela.</w:t>
+              <w:t>proceso de diagnóstico integral de las condiciones socioambientales, educativas y sanitarias de un entorno, vivienda o escuela.</w:t>
             </w:r>
           </w:p>
         </w:tc>
@@ -12285,35 +12106,12 @@
                 <w:lang w:eastAsia="es-CO"/>
               </w:rPr>
             </w:pPr>
-            <w:proofErr w:type="gramStart"/>
             <w:r>
               <w:rPr>
                 <w:sz w:val="24"/>
                 <w:szCs w:val="24"/>
               </w:rPr>
-              <w:t>monitoreo</w:t>
-            </w:r>
-            <w:proofErr w:type="gramEnd"/>
-            <w:r>
-              <w:rPr>
-                <w:sz w:val="24"/>
-                <w:szCs w:val="24"/>
-              </w:rPr>
-              <w:t xml:space="preserve"> constante de las condiciones socio</w:t>
-            </w:r>
-            <w:r>
-              <w:rPr>
-                <w:sz w:val="24"/>
-                <w:szCs w:val="24"/>
-              </w:rPr>
-              <w:t>-</w:t>
-            </w:r>
-            <w:r>
-              <w:rPr>
-                <w:sz w:val="24"/>
-                <w:szCs w:val="24"/>
-              </w:rPr>
-              <w:t>ambientales y sanitarias, para prevenir y responder a riesgos en los entornos escolares y comunitarios.</w:t>
+              <w:t>monitoreo constante de las condiciones socioambientales y sanitarias, para prevenir y responder a riesgos en los entornos escolares y comunitarios.</w:t>
             </w:r>
           </w:p>
         </w:tc>
@@ -12424,23 +12222,7 @@
           <w:sz w:val="24"/>
           <w:szCs w:val="24"/>
         </w:rPr>
-        <w:t xml:space="preserve">Organización mundial de la salud, organización panamericana de la salud, ministerio de la protección social, ministerio de educación nacional, ministerio de ambiente, vivienda y desarrollo territorial, &amp; departamento nacional de planeación. (2009). Herramientas para la caracterización y seguimiento de las condiciones </w:t>
-      </w:r>
-      <w:proofErr w:type="spellStart"/>
-      <w:r>
-        <w:rPr>
-          <w:sz w:val="24"/>
-          <w:szCs w:val="24"/>
-        </w:rPr>
-        <w:t>socioambientales</w:t>
-      </w:r>
-      <w:proofErr w:type="spellEnd"/>
-      <w:r>
-        <w:rPr>
-          <w:sz w:val="24"/>
-          <w:szCs w:val="24"/>
-        </w:rPr>
-        <w:t xml:space="preserve"> y sanitarias de los entornos (Documentos 06-07-16). </w:t>
+        <w:t xml:space="preserve">Organización mundial de la salud, organización panamericana de la salud, ministerio de la protección social, ministerio de educación nacional, ministerio de ambiente, vivienda y desarrollo territorial, &amp; departamento nacional de planeación. (2009). Herramientas para la caracterización y seguimiento de las condiciones socioambientales y sanitarias de los entornos (Documentos 06-07-16). </w:t>
       </w:r>
     </w:p>
     <w:p>
@@ -13542,12 +13324,7 @@
         <w:annotationRef/>
       </w:r>
       <w:r>
-        <w:t>Texto alternativo: Diagrama sobre la intervención y evaluación en entornos saludables, que resume la estrategia de escuelas saludables, la evaluación de la estrategia de entornos s</w:t>
-      </w:r>
-      <w:bookmarkStart w:id="7" w:name="_GoBack"/>
-      <w:bookmarkEnd w:id="7"/>
-      <w:r>
-        <w:t>aludables (EES), los elementos que debe incluir el PAIES según la OMS/OPS, y las directrices para la caracterización y seguimiento de la estrategia de entornos saludables.</w:t>
+        <w:t>Texto alternativo: Diagrama sobre la intervención y evaluación en entornos saludables, que resume la estrategia de escuelas saludables, la evaluación de la estrategia de entornos saludables (EES), los elementos que debe incluir el PAIES según la OMS/OPS, y las directrices para la caracterización y seguimiento de la estrategia de entornos saludables.</w:t>
       </w:r>
     </w:p>
   </w:comment>
@@ -22532,32 +22309,6 @@
 </file>
 
 <file path=customXml/item1.xml><?xml version="1.0" encoding="utf-8"?>
-<p:properties xmlns:p="http://schemas.microsoft.com/office/2006/metadata/properties" xmlns:xsi="http://www.w3.org/2001/XMLSchema-instance" xmlns:pc="http://schemas.microsoft.com/office/infopath/2007/PartnerControls">
-  <documentManagement>
-    <TaxCatchAll xmlns="cb45339b-ced9-4d0d-8f64-77573914d53b" xsi:nil="true"/>
-    <lcf76f155ced4ddcb4097134ff3c332f xmlns="43a3ca16-9c26-4813-b83f-4aec9927b43f">
-      <Terms xmlns="http://schemas.microsoft.com/office/infopath/2007/PartnerControls"/>
-    </lcf76f155ced4ddcb4097134ff3c332f>
-  </documentManagement>
-</p:properties>
-</file>
-
-<file path=customXml/item2.xml><?xml version="1.0" encoding="utf-8"?>
-<go:gDocsCustomXmlDataStorage xmlns:go="http://customooxmlschemas.google.com/" xmlns:r="http://schemas.openxmlformats.org/officeDocument/2006/relationships">
-  <go:docsCustomData xmlns:go="http://customooxmlschemas.google.com/" roundtripDataSignature="AMtx7mh3w1sXrKwdjzYCxjbwPkf7wsIk5w==">AMUW2mWhRc/xLonLdtoI8dz4BVu2GREgE7++Eme5Ko+W5/2G+QfXPKxV7NwLPPaJ77IM2LrlHDguxVZnDKcg4iQIvJIe+zJ9DBWjUaWFI+z0k4HbdiCFsJo=</go:docsCustomData>
-</go:gDocsCustomXmlDataStorage>
-</file>
-
-<file path=customXml/item3.xml><?xml version="1.0" encoding="utf-8"?>
-<?mso-contentType ?>
-<FormTemplates xmlns="http://schemas.microsoft.com/sharepoint/v3/contenttype/forms">
-  <Display>DocumentLibraryForm</Display>
-  <Edit>DocumentLibraryForm</Edit>
-  <New>DocumentLibraryForm</New>
-</FormTemplates>
-</file>
-
-<file path=customXml/item4.xml><?xml version="1.0" encoding="utf-8"?>
 <ct:contentTypeSchema xmlns:ct="http://schemas.microsoft.com/office/2006/metadata/contentType" xmlns:ma="http://schemas.microsoft.com/office/2006/metadata/properties/metaAttributes" ct:_="" ma:_="" ma:contentTypeName="Documento" ma:contentTypeID="0x01010049282E1EDBE9234EA9E6D38F720E265F" ma:contentTypeVersion="15" ma:contentTypeDescription="Crear nuevo documento." ma:contentTypeScope="" ma:versionID="b31c7aa9eaf043a08b87120b3c4916e3">
   <xsd:schema xmlns:xsd="http://www.w3.org/2001/XMLSchema" xmlns:xs="http://www.w3.org/2001/XMLSchema" xmlns:p="http://schemas.microsoft.com/office/2006/metadata/properties" xmlns:ns2="cb45339b-ced9-4d0d-8f64-77573914d53b" xmlns:ns3="43a3ca16-9c26-4813-b83f-4aec9927b43f" targetNamespace="http://schemas.microsoft.com/office/2006/metadata/properties" ma:root="true" ma:fieldsID="3533d065b04d75c457075bc55f1f5315" ns2:_="" ns3:_="">
     <xsd:import namespace="cb45339b-ced9-4d0d-8f64-77573914d53b"/>
@@ -22792,7 +22543,54 @@
 </ct:contentTypeSchema>
 </file>
 
+<file path=customXml/item2.xml><?xml version="1.0" encoding="utf-8"?>
+<?mso-contentType ?>
+<FormTemplates xmlns="http://schemas.microsoft.com/sharepoint/v3/contenttype/forms">
+  <Display>DocumentLibraryForm</Display>
+  <Edit>DocumentLibraryForm</Edit>
+  <New>DocumentLibraryForm</New>
+</FormTemplates>
+</file>
+
+<file path=customXml/item3.xml><?xml version="1.0" encoding="utf-8"?>
+<go:gDocsCustomXmlDataStorage xmlns:go="http://customooxmlschemas.google.com/" xmlns:r="http://schemas.openxmlformats.org/officeDocument/2006/relationships">
+  <go:docsCustomData xmlns:go="http://customooxmlschemas.google.com/" roundtripDataSignature="AMtx7mh3w1sXrKwdjzYCxjbwPkf7wsIk5w==">AMUW2mWhRc/xLonLdtoI8dz4BVu2GREgE7++Eme5Ko+W5/2G+QfXPKxV7NwLPPaJ77IM2LrlHDguxVZnDKcg4iQIvJIe+zJ9DBWjUaWFI+z0k4HbdiCFsJo=</go:docsCustomData>
+</go:gDocsCustomXmlDataStorage>
+</file>
+
+<file path=customXml/item4.xml><?xml version="1.0" encoding="utf-8"?>
+<p:properties xmlns:p="http://schemas.microsoft.com/office/2006/metadata/properties" xmlns:xsi="http://www.w3.org/2001/XMLSchema-instance" xmlns:pc="http://schemas.microsoft.com/office/infopath/2007/PartnerControls">
+  <documentManagement>
+    <TaxCatchAll xmlns="cb45339b-ced9-4d0d-8f64-77573914d53b" xsi:nil="true"/>
+    <lcf76f155ced4ddcb4097134ff3c332f xmlns="43a3ca16-9c26-4813-b83f-4aec9927b43f">
+      <Terms xmlns="http://schemas.microsoft.com/office/infopath/2007/PartnerControls"/>
+    </lcf76f155ced4ddcb4097134ff3c332f>
+  </documentManagement>
+</p:properties>
+</file>
+
 <file path=customXml/itemProps1.xml><?xml version="1.0" encoding="utf-8"?>
+<ds:datastoreItem xmlns:ds="http://schemas.openxmlformats.org/officeDocument/2006/customXml" ds:itemID="{175EAF9E-78D2-4A51-8E4C-43081305E3BA}"/>
+</file>
+
+<file path=customXml/itemProps2.xml><?xml version="1.0" encoding="utf-8"?>
+<ds:datastoreItem xmlns:ds="http://schemas.openxmlformats.org/officeDocument/2006/customXml" ds:itemID="{83102ECF-E44F-4F73-A78F-FE313D1BFB9A}">
+  <ds:schemaRefs>
+    <ds:schemaRef ds:uri="http://schemas.microsoft.com/sharepoint/v3/contenttype/forms"/>
+  </ds:schemaRefs>
+</ds:datastoreItem>
+</file>
+
+<file path=customXml/itemProps3.xml><?xml version="1.0" encoding="utf-8"?>
+<ds:datastoreItem xmlns:ds="http://schemas.openxmlformats.org/officeDocument/2006/customXml" ds:itemID="{11111111-1234-1234-1234-123412341234}">
+  <ds:schemaRefs>
+    <ds:schemaRef ds:uri="http://customooxmlschemas.google.com/"/>
+    <ds:schemaRef ds:uri="http://schemas.openxmlformats.org/officeDocument/2006/relationships"/>
+  </ds:schemaRefs>
+</ds:datastoreItem>
+</file>
+
+<file path=customXml/itemProps4.xml><?xml version="1.0" encoding="utf-8"?>
 <ds:datastoreItem xmlns:ds="http://schemas.openxmlformats.org/officeDocument/2006/customXml" ds:itemID="{9D9B1A75-0210-4935-8179-95DF20A26AD1}">
   <ds:schemaRefs>
     <ds:schemaRef ds:uri="http://schemas.microsoft.com/office/2006/metadata/properties"/>
@@ -22801,25 +22599,4 @@
     <ds:schemaRef ds:uri="8d1bea48-6525-4b05-8cf5-c6ad0dd5b02f"/>
   </ds:schemaRefs>
 </ds:datastoreItem>
-</file>
-
-<file path=customXml/itemProps2.xml><?xml version="1.0" encoding="utf-8"?>
-<ds:datastoreItem xmlns:ds="http://schemas.openxmlformats.org/officeDocument/2006/customXml" ds:itemID="{11111111-1234-1234-1234-123412341234}">
-  <ds:schemaRefs>
-    <ds:schemaRef ds:uri="http://customooxmlschemas.google.com/"/>
-    <ds:schemaRef ds:uri="http://schemas.openxmlformats.org/officeDocument/2006/relationships"/>
-  </ds:schemaRefs>
-</ds:datastoreItem>
-</file>
-
-<file path=customXml/itemProps3.xml><?xml version="1.0" encoding="utf-8"?>
-<ds:datastoreItem xmlns:ds="http://schemas.openxmlformats.org/officeDocument/2006/customXml" ds:itemID="{83102ECF-E44F-4F73-A78F-FE313D1BFB9A}">
-  <ds:schemaRefs>
-    <ds:schemaRef ds:uri="http://schemas.microsoft.com/sharepoint/v3/contenttype/forms"/>
-  </ds:schemaRefs>
-</ds:datastoreItem>
-</file>
-
-<file path=customXml/itemProps4.xml><?xml version="1.0" encoding="utf-8"?>
-<ds:datastoreItem xmlns:ds="http://schemas.openxmlformats.org/officeDocument/2006/customXml" ds:itemID="{C0FD4F76-C96C-43EB-A8E9-F8C59B3E49E4}"/>
 </file>
</xml_diff>